<commit_message>
docs: actualizar estado de la entrega con repositorio y ZIP publicados
</commit_message>
<xml_diff>
--- a/0_DOC_SOLUCIONES Y CAMBIOS/ANALISIS_DE_ERRORES.docx
+++ b/0_DOC_SOLUCIONES Y CAMBIOS/ANALISIS_DE_ERRORES.docx
@@ -978,15 +978,15 @@
           <w:sz w:val="22"/>
           <w:b/>
         </w:rPr>
-        <w:t xml:space="preserve">D-03 · Repositorio Git (PENDIENTE): </w:t>
-      </w:r>
-      <w:r>
-        <w:rPr>
-          <w:rFonts w:ascii="Calibri" w:hAnsi="Calibri"/>
-          <w:color w:val="333333"/>
-          <w:sz w:val="22"/>
-        </w:rPr>
-        <w:t xml:space="preserve">El pliego exige un repositorio Git con un mínimo de 5 commits descriptivos. Ninguno de los proyectos contiene carpeta .git: hay que crear el repositorio, hacer al menos 5 commits y publicar el enlace.</w:t>
+        <w:t xml:space="preserve">D-03 · Repositorio Git (RESUELTO): </w:t>
+      </w:r>
+      <w:r>
+        <w:rPr>
+          <w:rFonts w:ascii="Calibri" w:hAnsi="Calibri"/>
+          <w:color w:val="333333"/>
+          <w:sz w:val="22"/>
+        </w:rPr>
+        <w:t xml:space="preserve">El pliego exige un repositorio Git con un mínimo de 5 commits descriptivos. Se ha creado el repositorio local TAREAS_JJ, publicado en https://github.com/Noes3no/Ejercicio_jj con la rama main, 6 commits descriptivos y autor jj, y se ha verificado que el remoto apunta al mismo commit que el repositorio local.</w:t>
       </w:r>
     </w:p>
     <w:p>
@@ -1042,15 +1042,15 @@
           <w:sz w:val="22"/>
           <w:b/>
         </w:rPr>
-        <w:t xml:space="preserve">D-05 · Carpeta target/ (PENDIENTE): </w:t>
-      </w:r>
-      <w:r>
-        <w:rPr>
-          <w:rFonts w:ascii="Calibri" w:hAnsi="Calibri"/>
-          <w:color w:val="333333"/>
-          <w:sz w:val="22"/>
-        </w:rPr>
-        <w:t xml:space="preserve">El ZIP de entrega debe ir SIN la carpeta target/. Hay que excluirla al comprimir.</w:t>
+        <w:t xml:space="preserve">D-05 · Carpeta target/ (RESUELTO): </w:t>
+      </w:r>
+      <w:r>
+        <w:rPr>
+          <w:rFonts w:ascii="Calibri" w:hAnsi="Calibri"/>
+          <w:color w:val="333333"/>
+          <w:sz w:val="22"/>
+        </w:rPr>
+        <w:t xml:space="preserve">El ZIP de entrega debe ir SIN la carpeta target/. Se ha generado Garcia_Geijo_Juan_Jose_MF0493_3.zip (50 KB, 82 entradas) excluyendo target/, los JAR y la carpeta .git, con la carpeta raíz Garcia_Geijo_Juan_Jose_MF0493_3.</w:t>
       </w:r>
     </w:p>
     <w:p>
@@ -1271,7 +1271,7 @@
           <w:color w:val="333333"/>
           <w:sz w:val="22"/>
         </w:rPr>
-        <w:t xml:space="preserve">El pom.xml es funcional, pero falta el repositorio Git con 5 commits descriptivos.</w:t>
+        <w:t xml:space="preserve">Cumplido: el pom.xml es funcional y el repositorio Git publicado (https://github.com/Noes3no/Ejercicio_jj) contiene 6 commits descriptivos, por encima del mínimo de 5.</w:t>
       </w:r>
     </w:p>
     <w:p>
@@ -1364,7 +1364,21 @@
           <w:color w:val="333333"/>
           <w:sz w:val="22"/>
         </w:rPr>
-        <w:t xml:space="preserve">Los ejercicios del kit están correctamente resueltos: 24 de 24 pruebas superadas, JAR generado y aplicación funcionando con listado, alta y borrado. Los defectos encontrados eran de documentación y de entorno, no de lógica de programación, y se han corregido en esta revisión salvo los pendientes D-03, D-04 y D-05, que dependen de acciones externas (crear el repositorio Git, redactar la memoria PDF y preparar el ZIP final sin target/).</w:t>
+        <w:t xml:space="preserve">Los ejercicios del kit están correctamente resueltos: 24 de 24 pruebas superadas, JAR generado y aplicación funcionando con listado, alta y borrado. Los defectos encontrados eran de documentación y de entorno, no de lógica de programación, y se han corregido en esta revisión. También están resueltos el repositorio Git (6 commits publicados en https://github.com/Noes3no/Ejercicio_jj) y el ZIP de entrega sin target/.</w:t>
+      </w:r>
+    </w:p>
+    <w:p>
+      <w:pPr>
+        <w:jc w:val="left"/>
+        <w:spacing w:before="100" w:after="100"/>
+      </w:pPr>
+      <w:r>
+        <w:rPr>
+          <w:rFonts w:ascii="Calibri" w:hAnsi="Calibri"/>
+          <w:color w:val="333333"/>
+          <w:sz w:val="22"/>
+        </w:rPr>
+        <w:t xml:space="preserve">Queda un único pendiente: D-04, la memoria en PDF con datos personales, descripción, diagrama E-R, pasos de despliegue y capturas. Además, si la convocatoria exige el pliego completo, habría que ampliar los proyectos a 2 tablas relacionadas 1:N, capa Service, edición de registros y validación de formularios.</w:t>
       </w:r>
     </w:p>
     <w:sectPr>

</xml_diff>

<commit_message>
fix: forzar UTF-8 en data.sql y añadir memoria en Word y PDF
</commit_message>
<xml_diff>
--- a/0_DOC_SOLUCIONES Y CAMBIOS/ANALISIS_DE_ERRORES.docx
+++ b/0_DOC_SOLUCIONES Y CAMBIOS/ANALISIS_DE_ERRORES.docx
@@ -880,6 +880,38 @@
     </w:p>
     <w:p>
       <w:pPr>
+        <w:spacing w:before="40" w:after="40"/>
+        <w:ind w:left="360" w:hanging="220"/>
+      </w:pPr>
+      <w:r>
+        <w:rPr>
+          <w:rFonts w:ascii="Calibri" w:hAnsi="Calibri"/>
+          <w:color w:val="1F497D"/>
+          <w:sz w:val="22"/>
+          <w:b/>
+        </w:rPr>
+        <w:t xml:space="preserve">• </w:t>
+      </w:r>
+      <w:r>
+        <w:rPr>
+          <w:rFonts w:ascii="Calibri" w:hAnsi="Calibri"/>
+          <w:color w:val="1F497D"/>
+          <w:sz w:val="22"/>
+          <w:b/>
+        </w:rPr>
+        <w:t xml:space="preserve">C-09 · Codificación de data.sql (NUEVO, detectado el 27/10/2026): </w:t>
+      </w:r>
+      <w:r>
+        <w:rPr>
+          <w:rFonts w:ascii="Calibri" w:hAnsi="Calibri"/>
+          <w:color w:val="333333"/>
+          <w:sz w:val="22"/>
+        </w:rPr>
+        <w:t xml:space="preserve">Los acentos de los datos de ejemplo se mostraban corruptos en el navegador («AnÃ³nimo» en lugar de «Anónimo»). Spring leía data.sql con la codificación del sistema en vez de UTF-8. Corregido añadiendo spring.sql.init.encoding=UTF-8 en application.properties de los tres proyectos y verificado con una captura real de la aplicación.</w:t>
+      </w:r>
+    </w:p>
+    <w:p>
+      <w:pPr>
         <w:jc w:val="left"/>
         <w:spacing w:before="240" w:after="100"/>
       </w:pPr>
@@ -1010,15 +1042,15 @@
           <w:sz w:val="22"/>
           <w:b/>
         </w:rPr>
-        <w:t xml:space="preserve">D-04 · Memoria en PDF (PENDIENTE): </w:t>
-      </w:r>
-      <w:r>
-        <w:rPr>
-          <w:rFonts w:ascii="Calibri" w:hAnsi="Calibri"/>
-          <w:color w:val="333333"/>
-          <w:sz w:val="22"/>
-        </w:rPr>
-        <w:t xml:space="preserve">El pliego exige un PDF con datos personales, descripción, diagrama E-R, pasos de despliegue en otro entorno y capturas de la aplicación. No existe ese documento en la entrega.</w:t>
+        <w:t xml:space="preserve">D-04 · Memoria en PDF (RESUELTO): </w:t>
+      </w:r>
+      <w:r>
+        <w:rPr>
+          <w:rFonts w:ascii="Calibri" w:hAnsi="Calibri"/>
+          <w:color w:val="333333"/>
+          <w:sz w:val="22"/>
+        </w:rPr>
+        <w:t xml:space="preserve">Se ha elaborado la memoria completa en Word (Garcia_Geijo_Juan_Jose_Documentacion.docx) y exportado a PDF: 7 páginas con datos personales, descripción, diagrama E-R, capturas reales de la aplicación y pasos de despliegue en otro entorno.</w:t>
       </w:r>
     </w:p>
     <w:p>
@@ -1335,7 +1367,7 @@
           <w:color w:val="333333"/>
           <w:sz w:val="22"/>
         </w:rPr>
-        <w:t xml:space="preserve">El JAR se genera y se ejecuta, pero falta la memoria PDF con datos personales, diagrama E-R, pasos de despliegue y capturas.</w:t>
+        <w:t xml:space="preserve">Cumplido: el JAR se genera y se ejecuta, y la memoria en Word/PDF incluye datos personales, descripción, diagrama E-R, pasos de despliegue y capturas reales de la aplicación.</w:t>
       </w:r>
     </w:p>
     <w:p>
@@ -1378,7 +1410,7 @@
           <w:color w:val="333333"/>
           <w:sz w:val="22"/>
         </w:rPr>
-        <w:t xml:space="preserve">Queda un único pendiente: D-04, la memoria en PDF con datos personales, descripción, diagrama E-R, pasos de despliegue y capturas. Además, si la convocatoria exige el pliego completo, habría que ampliar los proyectos a 2 tablas relacionadas 1:N, capa Service, edición de registros y validación de formularios.</w:t>
+        <w:t xml:space="preserve">Queda un único pendiente: si la convocatoria exige el pliego completo, ampliar los proyectos a 2 tablas relacionadas 1:N, capa Service, edición de registros y validación de formularios. La documentación obligatoria (memoria en Word y PDF), el repositorio Git y el ZIP de entrega ya están finalizados.</w:t>
       </w:r>
     </w:p>
     <w:sectPr>

</xml_diff>